<commit_message>
Analytics improvements, documentation work
</commit_message>
<xml_diff>
--- a/Design & Documents/Technical Report.docx
+++ b/Design & Documents/Technical Report.docx
@@ -467,12 +467,7 @@
             <w:jc w:val="center"/>
           </w:pPr>
           <w:r>
-            <w:t xml:space="preserve">Table </w:t>
-          </w:r>
-          <w:bookmarkStart w:id="0" w:name="_GoBack"/>
-          <w:bookmarkEnd w:id="0"/>
-          <w:r>
-            <w:t xml:space="preserve">of </w:t>
+            <w:t xml:space="preserve">Table of </w:t>
           </w:r>
           <w:r>
             <w:t>Contents</w:t>
@@ -1170,12 +1165,12 @@
         <w:pStyle w:val="Heading1"/>
         <w:jc w:val="center"/>
       </w:pPr>
-      <w:bookmarkStart w:id="1" w:name="_Toc404160513"/>
+      <w:bookmarkStart w:id="0" w:name="_Toc404160513"/>
       <w:r>
         <w:lastRenderedPageBreak/>
         <w:t>Introduction</w:t>
       </w:r>
-      <w:bookmarkEnd w:id="1"/>
+      <w:bookmarkEnd w:id="0"/>
     </w:p>
     <w:p/>
     <w:p>
@@ -1221,85 +1216,475 @@
         <w:pStyle w:val="Heading1"/>
         <w:jc w:val="center"/>
       </w:pPr>
-      <w:bookmarkStart w:id="2" w:name="_Toc404160514"/>
+      <w:bookmarkStart w:id="1" w:name="_Toc404160514"/>
       <w:r>
         <w:t>Test Cases</w:t>
       </w:r>
-      <w:bookmarkEnd w:id="2"/>
+      <w:bookmarkEnd w:id="1"/>
     </w:p>
     <w:p/>
     <w:p>
       <w:pPr>
         <w:pStyle w:val="Heading2"/>
       </w:pPr>
-      <w:bookmarkStart w:id="3" w:name="_Toc404160515"/>
+      <w:bookmarkStart w:id="2" w:name="_Toc404160515"/>
       <w:r>
         <w:t>Direct Null Modem Connection</w:t>
       </w:r>
+      <w:bookmarkEnd w:id="2"/>
+    </w:p>
+    <w:p>
+      <w:pPr>
+        <w:pStyle w:val="Heading3"/>
+      </w:pPr>
+    </w:p>
+    <w:p>
+      <w:pPr>
+        <w:pStyle w:val="Heading3"/>
+      </w:pPr>
+      <w:bookmarkStart w:id="3" w:name="_Toc404160516"/>
+      <w:r>
+        <w:t>Statistics</w:t>
+      </w:r>
       <w:bookmarkEnd w:id="3"/>
     </w:p>
+    <w:p/>
+    <w:tbl>
+      <w:tblPr>
+        <w:tblStyle w:val="TableGridLight"/>
+        <w:tblW w:w="0" w:type="auto"/>
+        <w:tblLook w:val="04A0" w:firstRow="1" w:lastRow="0" w:firstColumn="1" w:lastColumn="0" w:noHBand="0" w:noVBand="1"/>
+      </w:tblPr>
+      <w:tblGrid>
+        <w:gridCol w:w="4788"/>
+        <w:gridCol w:w="4788"/>
+      </w:tblGrid>
+      <w:tr>
+        <w:tc>
+          <w:tcPr>
+            <w:tcW w:w="4788" w:type="dxa"/>
+          </w:tcPr>
+          <w:p>
+            <w:pPr>
+              <w:jc w:val="center"/>
+            </w:pPr>
+            <w:r>
+              <w:t>Single Message</w:t>
+            </w:r>
+          </w:p>
+        </w:tc>
+        <w:tc>
+          <w:tcPr>
+            <w:tcW w:w="4788" w:type="dxa"/>
+          </w:tcPr>
+          <w:p>
+            <w:pPr>
+              <w:jc w:val="center"/>
+            </w:pPr>
+            <w:r>
+              <w:t>Text File</w:t>
+            </w:r>
+          </w:p>
+        </w:tc>
+      </w:tr>
+      <w:tr>
+        <w:tc>
+          <w:tcPr>
+            <w:tcW w:w="4788" w:type="dxa"/>
+          </w:tcPr>
+          <w:p/>
+        </w:tc>
+        <w:tc>
+          <w:tcPr>
+            <w:tcW w:w="4788" w:type="dxa"/>
+          </w:tcPr>
+          <w:p>
+            <w:pPr>
+              <w:jc w:val="center"/>
+            </w:pPr>
+          </w:p>
+        </w:tc>
+      </w:tr>
+    </w:tbl>
+    <w:p/>
+    <w:p/>
     <w:p>
       <w:pPr>
         <w:pStyle w:val="Heading3"/>
       </w:pPr>
-    </w:p>
-    <w:p>
-      <w:pPr>
-        <w:pStyle w:val="Heading3"/>
-      </w:pPr>
-      <w:bookmarkStart w:id="4" w:name="_Toc404160516"/>
+      <w:bookmarkStart w:id="4" w:name="_Toc404160517"/>
       <w:r>
-        <w:t>Statistics</w:t>
+        <w:t>Results</w:t>
       </w:r>
       <w:bookmarkEnd w:id="4"/>
     </w:p>
     <w:p/>
+    <w:tbl>
+      <w:tblPr>
+        <w:tblStyle w:val="TableGridLight"/>
+        <w:tblW w:w="0" w:type="auto"/>
+        <w:tblLook w:val="04A0" w:firstRow="1" w:lastRow="0" w:firstColumn="1" w:lastColumn="0" w:noHBand="0" w:noVBand="1"/>
+      </w:tblPr>
+      <w:tblGrid>
+        <w:gridCol w:w="4788"/>
+        <w:gridCol w:w="4788"/>
+      </w:tblGrid>
+      <w:tr>
+        <w:tc>
+          <w:tcPr>
+            <w:tcW w:w="4788" w:type="dxa"/>
+          </w:tcPr>
+          <w:p>
+            <w:pPr>
+              <w:jc w:val="center"/>
+            </w:pPr>
+            <w:r>
+              <w:t>Single Message</w:t>
+            </w:r>
+          </w:p>
+        </w:tc>
+        <w:tc>
+          <w:tcPr>
+            <w:tcW w:w="4788" w:type="dxa"/>
+          </w:tcPr>
+          <w:p>
+            <w:pPr>
+              <w:jc w:val="center"/>
+            </w:pPr>
+            <w:r>
+              <w:t>Text File</w:t>
+            </w:r>
+          </w:p>
+        </w:tc>
+      </w:tr>
+      <w:tr>
+        <w:tc>
+          <w:tcPr>
+            <w:tcW w:w="4788" w:type="dxa"/>
+          </w:tcPr>
+          <w:p/>
+        </w:tc>
+        <w:tc>
+          <w:tcPr>
+            <w:tcW w:w="4788" w:type="dxa"/>
+          </w:tcPr>
+          <w:p>
+            <w:pPr>
+              <w:jc w:val="center"/>
+            </w:pPr>
+          </w:p>
+        </w:tc>
+      </w:tr>
+    </w:tbl>
+    <w:p/>
+    <w:p/>
     <w:p>
       <w:pPr>
-        <w:pStyle w:val="Heading3"/>
-      </w:pPr>
-      <w:bookmarkStart w:id="5" w:name="_Toc404160517"/>
+        <w:pStyle w:val="Heading2"/>
+      </w:pPr>
+      <w:bookmarkStart w:id="5" w:name="_Toc404160518"/>
       <w:r>
-        <w:t>Results</w:t>
+        <w:t>Straight Modem to Modem Connection</w:t>
       </w:r>
       <w:bookmarkEnd w:id="5"/>
+      <w:r>
+        <w:t xml:space="preserve"> (Busy Environment)</w:t>
+      </w:r>
     </w:p>
     <w:p/>
     <w:p>
       <w:pPr>
-        <w:pStyle w:val="Heading2"/>
-      </w:pPr>
-      <w:bookmarkStart w:id="6" w:name="_Toc404160518"/>
+        <w:pStyle w:val="Heading3"/>
+      </w:pPr>
+      <w:bookmarkStart w:id="6" w:name="_Toc404160519"/>
       <w:r>
-        <w:t>Straight Modem to Modem Connection</w:t>
+        <w:t>Statistics</w:t>
       </w:r>
       <w:bookmarkEnd w:id="6"/>
     </w:p>
     <w:p/>
+    <w:tbl>
+      <w:tblPr>
+        <w:tblStyle w:val="TableGridLight"/>
+        <w:tblW w:w="0" w:type="auto"/>
+        <w:tblLook w:val="04A0" w:firstRow="1" w:lastRow="0" w:firstColumn="1" w:lastColumn="0" w:noHBand="0" w:noVBand="1"/>
+      </w:tblPr>
+      <w:tblGrid>
+        <w:gridCol w:w="4788"/>
+        <w:gridCol w:w="4788"/>
+      </w:tblGrid>
+      <w:tr>
+        <w:tc>
+          <w:tcPr>
+            <w:tcW w:w="4788" w:type="dxa"/>
+          </w:tcPr>
+          <w:p>
+            <w:pPr>
+              <w:jc w:val="center"/>
+            </w:pPr>
+            <w:r>
+              <w:t>Single Message</w:t>
+            </w:r>
+          </w:p>
+        </w:tc>
+        <w:tc>
+          <w:tcPr>
+            <w:tcW w:w="4788" w:type="dxa"/>
+          </w:tcPr>
+          <w:p>
+            <w:pPr>
+              <w:jc w:val="center"/>
+            </w:pPr>
+            <w:r>
+              <w:t>Text File</w:t>
+            </w:r>
+          </w:p>
+        </w:tc>
+      </w:tr>
+      <w:tr>
+        <w:tc>
+          <w:tcPr>
+            <w:tcW w:w="4788" w:type="dxa"/>
+          </w:tcPr>
+          <w:p/>
+        </w:tc>
+        <w:tc>
+          <w:tcPr>
+            <w:tcW w:w="4788" w:type="dxa"/>
+          </w:tcPr>
+          <w:p>
+            <w:pPr>
+              <w:jc w:val="center"/>
+            </w:pPr>
+          </w:p>
+        </w:tc>
+      </w:tr>
+    </w:tbl>
+    <w:p/>
+    <w:p/>
     <w:p>
       <w:pPr>
         <w:pStyle w:val="Heading3"/>
       </w:pPr>
-      <w:bookmarkStart w:id="7" w:name="_Toc404160519"/>
+      <w:bookmarkStart w:id="7" w:name="_Toc404160520"/>
       <w:r>
-        <w:t>Statistics</w:t>
+        <w:t>Results</w:t>
       </w:r>
       <w:bookmarkEnd w:id="7"/>
     </w:p>
     <w:p/>
+    <w:tbl>
+      <w:tblPr>
+        <w:tblStyle w:val="TableGridLight"/>
+        <w:tblW w:w="0" w:type="auto"/>
+        <w:tblLook w:val="04A0" w:firstRow="1" w:lastRow="0" w:firstColumn="1" w:lastColumn="0" w:noHBand="0" w:noVBand="1"/>
+      </w:tblPr>
+      <w:tblGrid>
+        <w:gridCol w:w="4788"/>
+        <w:gridCol w:w="4788"/>
+      </w:tblGrid>
+      <w:tr>
+        <w:tc>
+          <w:tcPr>
+            <w:tcW w:w="4788" w:type="dxa"/>
+          </w:tcPr>
+          <w:p>
+            <w:pPr>
+              <w:jc w:val="center"/>
+            </w:pPr>
+            <w:r>
+              <w:t>Single Message</w:t>
+            </w:r>
+          </w:p>
+        </w:tc>
+        <w:tc>
+          <w:tcPr>
+            <w:tcW w:w="4788" w:type="dxa"/>
+          </w:tcPr>
+          <w:p>
+            <w:pPr>
+              <w:jc w:val="center"/>
+            </w:pPr>
+            <w:r>
+              <w:t>Text File</w:t>
+            </w:r>
+          </w:p>
+        </w:tc>
+      </w:tr>
+      <w:tr>
+        <w:tc>
+          <w:tcPr>
+            <w:tcW w:w="4788" w:type="dxa"/>
+          </w:tcPr>
+          <w:p/>
+        </w:tc>
+        <w:tc>
+          <w:tcPr>
+            <w:tcW w:w="4788" w:type="dxa"/>
+          </w:tcPr>
+          <w:p>
+            <w:pPr>
+              <w:jc w:val="center"/>
+            </w:pPr>
+          </w:p>
+        </w:tc>
+      </w:tr>
+    </w:tbl>
+    <w:p/>
+    <w:p/>
     <w:p>
       <w:pPr>
+        <w:pStyle w:val="Heading2"/>
+      </w:pPr>
+      <w:r>
+        <w:t>Straight Modem to Modem Connection (</w:t>
+      </w:r>
+      <w:r>
+        <w:t xml:space="preserve">Quiet </w:t>
+      </w:r>
+      <w:r>
+        <w:t>Environment)</w:t>
+      </w:r>
+    </w:p>
+    <w:p/>
+    <w:p>
+      <w:pPr>
         <w:pStyle w:val="Heading3"/>
       </w:pPr>
-      <w:bookmarkStart w:id="8" w:name="_Toc404160520"/>
+      <w:r>
+        <w:t>Statistics</w:t>
+      </w:r>
+    </w:p>
+    <w:p/>
+    <w:tbl>
+      <w:tblPr>
+        <w:tblStyle w:val="TableGridLight"/>
+        <w:tblW w:w="0" w:type="auto"/>
+        <w:tblLook w:val="04A0" w:firstRow="1" w:lastRow="0" w:firstColumn="1" w:lastColumn="0" w:noHBand="0" w:noVBand="1"/>
+      </w:tblPr>
+      <w:tblGrid>
+        <w:gridCol w:w="4788"/>
+        <w:gridCol w:w="4788"/>
+      </w:tblGrid>
+      <w:tr>
+        <w:tc>
+          <w:tcPr>
+            <w:tcW w:w="4788" w:type="dxa"/>
+          </w:tcPr>
+          <w:p>
+            <w:pPr>
+              <w:jc w:val="center"/>
+            </w:pPr>
+            <w:r>
+              <w:t>Single Message</w:t>
+            </w:r>
+          </w:p>
+        </w:tc>
+        <w:tc>
+          <w:tcPr>
+            <w:tcW w:w="4788" w:type="dxa"/>
+          </w:tcPr>
+          <w:p>
+            <w:pPr>
+              <w:jc w:val="center"/>
+            </w:pPr>
+            <w:r>
+              <w:t>Text File</w:t>
+            </w:r>
+          </w:p>
+        </w:tc>
+      </w:tr>
+      <w:tr>
+        <w:tc>
+          <w:tcPr>
+            <w:tcW w:w="4788" w:type="dxa"/>
+          </w:tcPr>
+          <w:p/>
+        </w:tc>
+        <w:tc>
+          <w:tcPr>
+            <w:tcW w:w="4788" w:type="dxa"/>
+          </w:tcPr>
+          <w:p>
+            <w:pPr>
+              <w:jc w:val="center"/>
+            </w:pPr>
+          </w:p>
+        </w:tc>
+      </w:tr>
+    </w:tbl>
+    <w:p/>
+    <w:p/>
+    <w:p>
+      <w:pPr>
+        <w:pStyle w:val="Heading3"/>
+      </w:pPr>
       <w:r>
         <w:t>Results</w:t>
       </w:r>
+    </w:p>
+    <w:p/>
+    <w:tbl>
+      <w:tblPr>
+        <w:tblStyle w:val="TableGridLight"/>
+        <w:tblW w:w="0" w:type="auto"/>
+        <w:tblLook w:val="04A0" w:firstRow="1" w:lastRow="0" w:firstColumn="1" w:lastColumn="0" w:noHBand="0" w:noVBand="1"/>
+      </w:tblPr>
+      <w:tblGrid>
+        <w:gridCol w:w="4788"/>
+        <w:gridCol w:w="4788"/>
+      </w:tblGrid>
+      <w:tr>
+        <w:tc>
+          <w:tcPr>
+            <w:tcW w:w="4788" w:type="dxa"/>
+          </w:tcPr>
+          <w:p>
+            <w:pPr>
+              <w:jc w:val="center"/>
+            </w:pPr>
+            <w:r>
+              <w:t>Single Message</w:t>
+            </w:r>
+          </w:p>
+        </w:tc>
+        <w:tc>
+          <w:tcPr>
+            <w:tcW w:w="4788" w:type="dxa"/>
+          </w:tcPr>
+          <w:p>
+            <w:pPr>
+              <w:jc w:val="center"/>
+            </w:pPr>
+            <w:r>
+              <w:t>Text File</w:t>
+            </w:r>
+          </w:p>
+        </w:tc>
+      </w:tr>
+      <w:tr>
+        <w:tc>
+          <w:tcPr>
+            <w:tcW w:w="4788" w:type="dxa"/>
+          </w:tcPr>
+          <w:p/>
+        </w:tc>
+        <w:tc>
+          <w:tcPr>
+            <w:tcW w:w="4788" w:type="dxa"/>
+          </w:tcPr>
+          <w:p>
+            <w:pPr>
+              <w:jc w:val="center"/>
+            </w:pPr>
+          </w:p>
+        </w:tc>
+      </w:tr>
+    </w:tbl>
+    <w:p>
+      <w:bookmarkStart w:id="8" w:name="_GoBack"/>
       <w:bookmarkEnd w:id="8"/>
     </w:p>
-    <w:p/>
-    <w:p/>
-    <w:p/>
     <w:p/>
     <w:p/>
     <w:p/>
@@ -3658,6 +4043,44 @@
       <w:ind w:left="420"/>
     </w:pPr>
   </w:style>
+  <w:style w:type="table" w:styleId="TableGrid">
+    <w:name w:val="Table Grid"/>
+    <w:basedOn w:val="TableNormal"/>
+    <w:uiPriority w:val="39"/>
+    <w:rsid w:val="00E1082D"/>
+    <w:pPr>
+      <w:spacing w:after="0" w:line="240" w:lineRule="auto"/>
+    </w:pPr>
+    <w:tblPr>
+      <w:tblBorders>
+        <w:top w:val="single" w:sz="4" w:space="0" w:color="auto"/>
+        <w:left w:val="single" w:sz="4" w:space="0" w:color="auto"/>
+        <w:bottom w:val="single" w:sz="4" w:space="0" w:color="auto"/>
+        <w:right w:val="single" w:sz="4" w:space="0" w:color="auto"/>
+        <w:insideH w:val="single" w:sz="4" w:space="0" w:color="auto"/>
+        <w:insideV w:val="single" w:sz="4" w:space="0" w:color="auto"/>
+      </w:tblBorders>
+    </w:tblPr>
+  </w:style>
+  <w:style w:type="table" w:styleId="TableGridLight">
+    <w:name w:val="Grid Table Light"/>
+    <w:basedOn w:val="TableNormal"/>
+    <w:uiPriority w:val="40"/>
+    <w:rsid w:val="00E1082D"/>
+    <w:pPr>
+      <w:spacing w:after="0" w:line="240" w:lineRule="auto"/>
+    </w:pPr>
+    <w:tblPr>
+      <w:tblBorders>
+        <w:top w:val="single" w:sz="4" w:space="0" w:color="BFBFBF" w:themeColor="background1" w:themeShade="BF"/>
+        <w:left w:val="single" w:sz="4" w:space="0" w:color="BFBFBF" w:themeColor="background1" w:themeShade="BF"/>
+        <w:bottom w:val="single" w:sz="4" w:space="0" w:color="BFBFBF" w:themeColor="background1" w:themeShade="BF"/>
+        <w:right w:val="single" w:sz="4" w:space="0" w:color="BFBFBF" w:themeColor="background1" w:themeShade="BF"/>
+        <w:insideH w:val="single" w:sz="4" w:space="0" w:color="BFBFBF" w:themeColor="background1" w:themeShade="BF"/>
+        <w:insideV w:val="single" w:sz="4" w:space="0" w:color="BFBFBF" w:themeColor="background1" w:themeShade="BF"/>
+      </w:tblBorders>
+    </w:tblPr>
+  </w:style>
 </w:styles>
 </file>
 
@@ -3805,6 +4228,7 @@
     <w:rsid w:val="003834BE"/>
     <w:rsid w:val="005B0C18"/>
     <w:rsid w:val="005F3699"/>
+    <w:rsid w:val="006D0930"/>
     <w:rsid w:val="006D4F45"/>
     <w:rsid w:val="007A6147"/>
     <w:rsid w:val="00B41314"/>
@@ -4578,7 +5002,7 @@
 </file>
 
 <file path=customXml/itemProps1.xml><?xml version="1.0" encoding="utf-8"?>
-<ds:datastoreItem xmlns:ds="http://schemas.openxmlformats.org/officeDocument/2006/customXml" ds:itemID="{D485A14B-F2EC-4408-8380-CFC855BD8EC7}">
+<ds:datastoreItem xmlns:ds="http://schemas.openxmlformats.org/officeDocument/2006/customXml" ds:itemID="{7DAEBF3C-E877-45A1-8A54-32BE4930B8F0}">
   <ds:schemaRefs>
     <ds:schemaRef ds:uri="http://schemas.openxmlformats.org/officeDocument/2006/bibliography"/>
   </ds:schemaRefs>

</xml_diff>

<commit_message>
I have no idea what I did
</commit_message>
<xml_diff>
--- a/Design & Documents/Technical Report.docx
+++ b/Design & Documents/Technical Report.docx
@@ -1251,7 +1251,7 @@
     <w:p/>
     <w:tbl>
       <w:tblPr>
-        <w:tblStyle w:val="TableGridLight"/>
+        <w:tblStyle w:val="PlainTable3"/>
         <w:tblW w:w="0" w:type="auto"/>
         <w:tblLook w:val="04A0" w:firstRow="1" w:lastRow="0" w:firstColumn="1" w:lastColumn="0" w:noHBand="0" w:noVBand="1"/>
       </w:tblPr>
@@ -1260,8 +1260,12 @@
         <w:gridCol w:w="4788"/>
       </w:tblGrid>
       <w:tr>
+        <w:trPr>
+          <w:cnfStyle w:val="100000000000" w:firstRow="1" w:lastRow="0" w:firstColumn="0" w:lastColumn="0" w:oddVBand="0" w:evenVBand="0" w:oddHBand="0" w:evenHBand="0" w:firstRowFirstColumn="0" w:firstRowLastColumn="0" w:lastRowFirstColumn="0" w:lastRowLastColumn="0"/>
+        </w:trPr>
         <w:tc>
           <w:tcPr>
+            <w:cnfStyle w:val="001000000100" w:firstRow="0" w:lastRow="0" w:firstColumn="1" w:lastColumn="0" w:oddVBand="0" w:evenVBand="0" w:oddHBand="0" w:evenHBand="0" w:firstRowFirstColumn="1" w:firstRowLastColumn="0" w:lastRowFirstColumn="0" w:lastRowLastColumn="0"/>
             <w:tcW w:w="4788" w:type="dxa"/>
           </w:tcPr>
           <w:p>
@@ -1280,6 +1284,7 @@
           <w:p>
             <w:pPr>
               <w:jc w:val="center"/>
+              <w:cnfStyle w:val="100000000000" w:firstRow="1" w:lastRow="0" w:firstColumn="0" w:lastColumn="0" w:oddVBand="0" w:evenVBand="0" w:oddHBand="0" w:evenHBand="0" w:firstRowFirstColumn="0" w:firstRowLastColumn="0" w:lastRowFirstColumn="0" w:lastRowLastColumn="0"/>
             </w:pPr>
             <w:r>
               <w:t>Text File</w:t>
@@ -1288,59 +1293,17 @@
         </w:tc>
       </w:tr>
       <w:tr>
+        <w:trPr>
+          <w:cnfStyle w:val="000000100000" w:firstRow="0" w:lastRow="0" w:firstColumn="0" w:lastColumn="0" w:oddVBand="0" w:evenVBand="0" w:oddHBand="1" w:evenHBand="0" w:firstRowFirstColumn="0" w:firstRowLastColumn="0" w:lastRowFirstColumn="0" w:lastRowLastColumn="0"/>
+        </w:trPr>
         <w:tc>
           <w:tcPr>
-            <w:tcW w:w="4788" w:type="dxa"/>
-          </w:tcPr>
-          <w:p/>
-        </w:tc>
-        <w:tc>
-          <w:tcPr>
+            <w:cnfStyle w:val="001000000000" w:firstRow="0" w:lastRow="0" w:firstColumn="1" w:lastColumn="0" w:oddVBand="0" w:evenVBand="0" w:oddHBand="0" w:evenHBand="0" w:firstRowFirstColumn="0" w:firstRowLastColumn="0" w:lastRowFirstColumn="0" w:lastRowLastColumn="0"/>
             <w:tcW w:w="4788" w:type="dxa"/>
           </w:tcPr>
           <w:p>
-            <w:pPr>
-              <w:jc w:val="center"/>
-            </w:pPr>
-          </w:p>
-        </w:tc>
-      </w:tr>
-    </w:tbl>
-    <w:p/>
-    <w:p/>
-    <w:p>
-      <w:pPr>
-        <w:pStyle w:val="Heading3"/>
-      </w:pPr>
-      <w:bookmarkStart w:id="4" w:name="_Toc404160517"/>
-      <w:r>
-        <w:t>Results</w:t>
-      </w:r>
-      <w:bookmarkEnd w:id="4"/>
-    </w:p>
-    <w:p/>
-    <w:tbl>
-      <w:tblPr>
-        <w:tblStyle w:val="TableGridLight"/>
-        <w:tblW w:w="0" w:type="auto"/>
-        <w:tblLook w:val="04A0" w:firstRow="1" w:lastRow="0" w:firstColumn="1" w:lastColumn="0" w:noHBand="0" w:noVBand="1"/>
-      </w:tblPr>
-      <w:tblGrid>
-        <w:gridCol w:w="4788"/>
-        <w:gridCol w:w="4788"/>
-      </w:tblGrid>
-      <w:tr>
-        <w:tc>
-          <w:tcPr>
-            <w:tcW w:w="4788" w:type="dxa"/>
-          </w:tcPr>
-          <w:p>
-            <w:pPr>
-              <w:jc w:val="center"/>
-            </w:pPr>
-            <w:r>
-              <w:t>Single Message</w:t>
-            </w:r>
+            <w:bookmarkStart w:id="4" w:name="_GoBack"/>
+            <w:bookmarkEnd w:id="4"/>
           </w:p>
         </w:tc>
         <w:tc>
@@ -1350,27 +1313,7 @@
           <w:p>
             <w:pPr>
               <w:jc w:val="center"/>
-            </w:pPr>
-            <w:r>
-              <w:t>Text File</w:t>
-            </w:r>
-          </w:p>
-        </w:tc>
-      </w:tr>
-      <w:tr>
-        <w:tc>
-          <w:tcPr>
-            <w:tcW w:w="4788" w:type="dxa"/>
-          </w:tcPr>
-          <w:p/>
-        </w:tc>
-        <w:tc>
-          <w:tcPr>
-            <w:tcW w:w="4788" w:type="dxa"/>
-          </w:tcPr>
-          <w:p>
-            <w:pPr>
-              <w:jc w:val="center"/>
+              <w:cnfStyle w:val="000000100000" w:firstRow="0" w:lastRow="0" w:firstColumn="0" w:lastColumn="0" w:oddVBand="0" w:evenVBand="0" w:oddHBand="1" w:evenHBand="0" w:firstRowFirstColumn="0" w:firstRowLastColumn="0" w:lastRowFirstColumn="0" w:lastRowLastColumn="0"/>
             </w:pPr>
           </w:p>
         </w:tc>
@@ -1380,13 +1323,26 @@
     <w:p/>
     <w:p>
       <w:pPr>
+        <w:pStyle w:val="Heading3"/>
+      </w:pPr>
+      <w:bookmarkStart w:id="5" w:name="_Toc404160517"/>
+      <w:r>
+        <w:t>Results</w:t>
+      </w:r>
+      <w:bookmarkEnd w:id="5"/>
+    </w:p>
+    <w:p/>
+    <w:p/>
+    <w:p/>
+    <w:p>
+      <w:pPr>
         <w:pStyle w:val="Heading2"/>
       </w:pPr>
-      <w:bookmarkStart w:id="5" w:name="_Toc404160518"/>
+      <w:bookmarkStart w:id="6" w:name="_Toc404160518"/>
       <w:r>
         <w:t>Straight Modem to Modem Connection</w:t>
       </w:r>
-      <w:bookmarkEnd w:id="5"/>
+      <w:bookmarkEnd w:id="6"/>
       <w:r>
         <w:t xml:space="preserve"> (Busy Environment)</w:t>
       </w:r>
@@ -1396,154 +1352,34 @@
       <w:pPr>
         <w:pStyle w:val="Heading3"/>
       </w:pPr>
-      <w:bookmarkStart w:id="6" w:name="_Toc404160519"/>
+      <w:bookmarkStart w:id="7" w:name="_Toc404160519"/>
       <w:r>
         <w:t>Statistics</w:t>
-      </w:r>
-      <w:bookmarkEnd w:id="6"/>
-    </w:p>
-    <w:p/>
-    <w:tbl>
-      <w:tblPr>
-        <w:tblStyle w:val="TableGridLight"/>
-        <w:tblW w:w="0" w:type="auto"/>
-        <w:tblLook w:val="04A0" w:firstRow="1" w:lastRow="0" w:firstColumn="1" w:lastColumn="0" w:noHBand="0" w:noVBand="1"/>
-      </w:tblPr>
-      <w:tblGrid>
-        <w:gridCol w:w="4788"/>
-        <w:gridCol w:w="4788"/>
-      </w:tblGrid>
-      <w:tr>
-        <w:tc>
-          <w:tcPr>
-            <w:tcW w:w="4788" w:type="dxa"/>
-          </w:tcPr>
-          <w:p>
-            <w:pPr>
-              <w:jc w:val="center"/>
-            </w:pPr>
-            <w:r>
-              <w:t>Single Message</w:t>
-            </w:r>
-          </w:p>
-        </w:tc>
-        <w:tc>
-          <w:tcPr>
-            <w:tcW w:w="4788" w:type="dxa"/>
-          </w:tcPr>
-          <w:p>
-            <w:pPr>
-              <w:jc w:val="center"/>
-            </w:pPr>
-            <w:r>
-              <w:t>Text File</w:t>
-            </w:r>
-          </w:p>
-        </w:tc>
-      </w:tr>
-      <w:tr>
-        <w:tc>
-          <w:tcPr>
-            <w:tcW w:w="4788" w:type="dxa"/>
-          </w:tcPr>
-          <w:p/>
-        </w:tc>
-        <w:tc>
-          <w:tcPr>
-            <w:tcW w:w="4788" w:type="dxa"/>
-          </w:tcPr>
-          <w:p>
-            <w:pPr>
-              <w:jc w:val="center"/>
-            </w:pPr>
-          </w:p>
-        </w:tc>
-      </w:tr>
-    </w:tbl>
-    <w:p/>
-    <w:p/>
-    <w:p>
-      <w:pPr>
-        <w:pStyle w:val="Heading3"/>
-      </w:pPr>
-      <w:bookmarkStart w:id="7" w:name="_Toc404160520"/>
-      <w:r>
-        <w:t>Results</w:t>
       </w:r>
       <w:bookmarkEnd w:id="7"/>
     </w:p>
     <w:p/>
-    <w:tbl>
-      <w:tblPr>
-        <w:tblStyle w:val="TableGridLight"/>
-        <w:tblW w:w="0" w:type="auto"/>
-        <w:tblLook w:val="04A0" w:firstRow="1" w:lastRow="0" w:firstColumn="1" w:lastColumn="0" w:noHBand="0" w:noVBand="1"/>
-      </w:tblPr>
-      <w:tblGrid>
-        <w:gridCol w:w="4788"/>
-        <w:gridCol w:w="4788"/>
-      </w:tblGrid>
-      <w:tr>
-        <w:tc>
-          <w:tcPr>
-            <w:tcW w:w="4788" w:type="dxa"/>
-          </w:tcPr>
-          <w:p>
-            <w:pPr>
-              <w:jc w:val="center"/>
-            </w:pPr>
-            <w:r>
-              <w:t>Single Message</w:t>
-            </w:r>
-          </w:p>
-        </w:tc>
-        <w:tc>
-          <w:tcPr>
-            <w:tcW w:w="4788" w:type="dxa"/>
-          </w:tcPr>
-          <w:p>
-            <w:pPr>
-              <w:jc w:val="center"/>
-            </w:pPr>
-            <w:r>
-              <w:t>Text File</w:t>
-            </w:r>
-          </w:p>
-        </w:tc>
-      </w:tr>
-      <w:tr>
-        <w:tc>
-          <w:tcPr>
-            <w:tcW w:w="4788" w:type="dxa"/>
-          </w:tcPr>
-          <w:p/>
-        </w:tc>
-        <w:tc>
-          <w:tcPr>
-            <w:tcW w:w="4788" w:type="dxa"/>
-          </w:tcPr>
-          <w:p>
-            <w:pPr>
-              <w:jc w:val="center"/>
-            </w:pPr>
-          </w:p>
-        </w:tc>
-      </w:tr>
-    </w:tbl>
     <w:p/>
     <w:p/>
     <w:p>
       <w:pPr>
+        <w:pStyle w:val="Heading3"/>
+      </w:pPr>
+      <w:bookmarkStart w:id="8" w:name="_Toc404160520"/>
+      <w:r>
+        <w:t>Results</w:t>
+      </w:r>
+      <w:bookmarkEnd w:id="8"/>
+    </w:p>
+    <w:p/>
+    <w:p/>
+    <w:p/>
+    <w:p>
+      <w:pPr>
         <w:pStyle w:val="Heading2"/>
       </w:pPr>
       <w:r>
-        <w:t>Straight Modem to Modem Connection (</w:t>
-      </w:r>
-      <w:r>
-        <w:t xml:space="preserve">Quiet </w:t>
-      </w:r>
-      <w:r>
-        <w:t>Environment)</w:t>
+        <w:t>Straight Modem to Modem Connection (Quiet Environment)</w:t>
       </w:r>
     </w:p>
     <w:p/>
@@ -1552,67 +1388,11 @@
         <w:pStyle w:val="Heading3"/>
       </w:pPr>
       <w:r>
+        <w:lastRenderedPageBreak/>
         <w:t>Statistics</w:t>
       </w:r>
     </w:p>
     <w:p/>
-    <w:tbl>
-      <w:tblPr>
-        <w:tblStyle w:val="TableGridLight"/>
-        <w:tblW w:w="0" w:type="auto"/>
-        <w:tblLook w:val="04A0" w:firstRow="1" w:lastRow="0" w:firstColumn="1" w:lastColumn="0" w:noHBand="0" w:noVBand="1"/>
-      </w:tblPr>
-      <w:tblGrid>
-        <w:gridCol w:w="4788"/>
-        <w:gridCol w:w="4788"/>
-      </w:tblGrid>
-      <w:tr>
-        <w:tc>
-          <w:tcPr>
-            <w:tcW w:w="4788" w:type="dxa"/>
-          </w:tcPr>
-          <w:p>
-            <w:pPr>
-              <w:jc w:val="center"/>
-            </w:pPr>
-            <w:r>
-              <w:t>Single Message</w:t>
-            </w:r>
-          </w:p>
-        </w:tc>
-        <w:tc>
-          <w:tcPr>
-            <w:tcW w:w="4788" w:type="dxa"/>
-          </w:tcPr>
-          <w:p>
-            <w:pPr>
-              <w:jc w:val="center"/>
-            </w:pPr>
-            <w:r>
-              <w:t>Text File</w:t>
-            </w:r>
-          </w:p>
-        </w:tc>
-      </w:tr>
-      <w:tr>
-        <w:tc>
-          <w:tcPr>
-            <w:tcW w:w="4788" w:type="dxa"/>
-          </w:tcPr>
-          <w:p/>
-        </w:tc>
-        <w:tc>
-          <w:tcPr>
-            <w:tcW w:w="4788" w:type="dxa"/>
-          </w:tcPr>
-          <w:p>
-            <w:pPr>
-              <w:jc w:val="center"/>
-            </w:pPr>
-          </w:p>
-        </w:tc>
-      </w:tr>
-    </w:tbl>
     <w:p/>
     <w:p/>
     <w:p>
@@ -1624,67 +1404,7 @@
       </w:r>
     </w:p>
     <w:p/>
-    <w:tbl>
-      <w:tblPr>
-        <w:tblStyle w:val="TableGridLight"/>
-        <w:tblW w:w="0" w:type="auto"/>
-        <w:tblLook w:val="04A0" w:firstRow="1" w:lastRow="0" w:firstColumn="1" w:lastColumn="0" w:noHBand="0" w:noVBand="1"/>
-      </w:tblPr>
-      <w:tblGrid>
-        <w:gridCol w:w="4788"/>
-        <w:gridCol w:w="4788"/>
-      </w:tblGrid>
-      <w:tr>
-        <w:tc>
-          <w:tcPr>
-            <w:tcW w:w="4788" w:type="dxa"/>
-          </w:tcPr>
-          <w:p>
-            <w:pPr>
-              <w:jc w:val="center"/>
-            </w:pPr>
-            <w:r>
-              <w:t>Single Message</w:t>
-            </w:r>
-          </w:p>
-        </w:tc>
-        <w:tc>
-          <w:tcPr>
-            <w:tcW w:w="4788" w:type="dxa"/>
-          </w:tcPr>
-          <w:p>
-            <w:pPr>
-              <w:jc w:val="center"/>
-            </w:pPr>
-            <w:r>
-              <w:t>Text File</w:t>
-            </w:r>
-          </w:p>
-        </w:tc>
-      </w:tr>
-      <w:tr>
-        <w:tc>
-          <w:tcPr>
-            <w:tcW w:w="4788" w:type="dxa"/>
-          </w:tcPr>
-          <w:p/>
-        </w:tc>
-        <w:tc>
-          <w:tcPr>
-            <w:tcW w:w="4788" w:type="dxa"/>
-          </w:tcPr>
-          <w:p>
-            <w:pPr>
-              <w:jc w:val="center"/>
-            </w:pPr>
-          </w:p>
-        </w:tc>
-      </w:tr>
-    </w:tbl>
-    <w:p>
-      <w:bookmarkStart w:id="8" w:name="_GoBack"/>
-      <w:bookmarkEnd w:id="8"/>
-    </w:p>
+    <w:p/>
     <w:p/>
     <w:p/>
     <w:p/>
@@ -4081,6 +3801,99 @@
       </w:tblBorders>
     </w:tblPr>
   </w:style>
+  <w:style w:type="table" w:styleId="PlainTable3">
+    <w:name w:val="Plain Table 3"/>
+    <w:basedOn w:val="TableNormal"/>
+    <w:uiPriority w:val="43"/>
+    <w:rsid w:val="00DF5885"/>
+    <w:pPr>
+      <w:spacing w:after="0" w:line="240" w:lineRule="auto"/>
+    </w:pPr>
+    <w:tblPr>
+      <w:tblStyleRowBandSize w:val="1"/>
+      <w:tblStyleColBandSize w:val="1"/>
+    </w:tblPr>
+    <w:tblStylePr w:type="firstRow">
+      <w:rPr>
+        <w:b/>
+        <w:bCs/>
+        <w:caps/>
+      </w:rPr>
+      <w:tblPr/>
+      <w:tcPr>
+        <w:tcBorders>
+          <w:bottom w:val="single" w:sz="4" w:space="0" w:color="7F7F7F" w:themeColor="text1" w:themeTint="80"/>
+        </w:tcBorders>
+      </w:tcPr>
+    </w:tblStylePr>
+    <w:tblStylePr w:type="lastRow">
+      <w:rPr>
+        <w:b/>
+        <w:bCs/>
+        <w:caps/>
+      </w:rPr>
+      <w:tblPr/>
+      <w:tcPr>
+        <w:tcBorders>
+          <w:top w:val="nil"/>
+        </w:tcBorders>
+      </w:tcPr>
+    </w:tblStylePr>
+    <w:tblStylePr w:type="firstCol">
+      <w:rPr>
+        <w:b/>
+        <w:bCs/>
+        <w:caps/>
+      </w:rPr>
+      <w:tblPr/>
+      <w:tcPr>
+        <w:tcBorders>
+          <w:right w:val="single" w:sz="4" w:space="0" w:color="7F7F7F" w:themeColor="text1" w:themeTint="80"/>
+        </w:tcBorders>
+      </w:tcPr>
+    </w:tblStylePr>
+    <w:tblStylePr w:type="lastCol">
+      <w:rPr>
+        <w:b/>
+        <w:bCs/>
+        <w:caps/>
+      </w:rPr>
+      <w:tblPr/>
+      <w:tcPr>
+        <w:tcBorders>
+          <w:left w:val="nil"/>
+        </w:tcBorders>
+      </w:tcPr>
+    </w:tblStylePr>
+    <w:tblStylePr w:type="band1Vert">
+      <w:tblPr/>
+      <w:tcPr>
+        <w:shd w:val="clear" w:color="auto" w:fill="F2F2F2" w:themeFill="background1" w:themeFillShade="F2"/>
+      </w:tcPr>
+    </w:tblStylePr>
+    <w:tblStylePr w:type="band1Horz">
+      <w:tblPr/>
+      <w:tcPr>
+        <w:shd w:val="clear" w:color="auto" w:fill="F2F2F2" w:themeFill="background1" w:themeFillShade="F2"/>
+      </w:tcPr>
+    </w:tblStylePr>
+    <w:tblStylePr w:type="neCell">
+      <w:tblPr/>
+      <w:tcPr>
+        <w:tcBorders>
+          <w:left w:val="nil"/>
+        </w:tcBorders>
+      </w:tcPr>
+    </w:tblStylePr>
+    <w:tblStylePr w:type="nwCell">
+      <w:tblPr/>
+      <w:tcPr>
+        <w:tcBorders>
+          <w:right w:val="nil"/>
+        </w:tcBorders>
+      </w:tcPr>
+    </w:tblStylePr>
+  </w:style>
 </w:styles>
 </file>
 
@@ -4228,6 +4041,7 @@
     <w:rsid w:val="003834BE"/>
     <w:rsid w:val="005B0C18"/>
     <w:rsid w:val="005F3699"/>
+    <w:rsid w:val="006257FB"/>
     <w:rsid w:val="006D0930"/>
     <w:rsid w:val="006D4F45"/>
     <w:rsid w:val="007A6147"/>
@@ -5002,7 +4816,7 @@
 </file>
 
 <file path=customXml/itemProps1.xml><?xml version="1.0" encoding="utf-8"?>
-<ds:datastoreItem xmlns:ds="http://schemas.openxmlformats.org/officeDocument/2006/customXml" ds:itemID="{7DAEBF3C-E877-45A1-8A54-32BE4930B8F0}">
+<ds:datastoreItem xmlns:ds="http://schemas.openxmlformats.org/officeDocument/2006/customXml" ds:itemID="{846AA52C-4184-4737-ABEE-08ABF28E3B68}">
   <ds:schemaRefs>
     <ds:schemaRef ds:uri="http://schemas.openxmlformats.org/officeDocument/2006/bibliography"/>
   </ds:schemaRefs>

</xml_diff>